<commit_message>
diario 11.09.2026 + Inizio docu
</commit_message>
<xml_diff>
--- a/1_QdC/QdC_AgendaIntelligente.docx
+++ b/1_QdC/QdC_AgendaIntelligente.docx
@@ -2786,6 +2786,9 @@
       <w:r>
         <w:t>1 PC di sviluppo (Windows) con strumenti per la compilazione multipiatta</w:t>
       </w:r>
+      <w:r>
+        <w:t>forma</w:t>
+      </w:r>
     </w:p>
     <w:p>
       <w:pPr>
@@ -3054,7 +3057,7 @@
         <w:spacing w:before="56"/>
       </w:pPr>
       <w:r>
-        <w:t>Conoscenze sull'integrazione di API REST / WebSocket e sull'uso di moduli AI/LLM sia in cloud sia locali (es. bindings C++ tramite dart:ffi)</w:t>
+        <w:t>Conoscenze sull'integrazione di API REST e sull'uso di moduli AI/LLM sia in cloud sia locali (es. bindings C++ tramite dart:ffi)</w:t>
       </w:r>
     </w:p>
     <w:p>
@@ -3428,10 +3431,7 @@
         <w:t xml:space="preserve"> Data e Ora di inizio/fine, Categoria (es. Lavoro, Studio, Personale</w:t>
       </w:r>
       <w:r>
-        <w:t xml:space="preserve">), </w:t>
-      </w:r>
-      <w:r>
-        <w:t>completata</w:t>
+        <w:t>), completata</w:t>
       </w:r>
       <w:r>
         <w:t>.</w:t>
@@ -9111,6 +9111,7 @@
   <w:style w:type="character" w:default="1" w:styleId="Carpredefinitoparagrafo">
     <w:name w:val="Default Paragraph Font"/>
     <w:uiPriority w:val="1"/>
+    <w:semiHidden/>
     <w:unhideWhenUsed/>
   </w:style>
   <w:style w:type="table" w:default="1" w:styleId="Tabellanormale">

</xml_diff>